<commit_message>
Remove em-dash punctuation and add internal links to WomenTech Network
Rewrites the article (markdown and .docx) to eliminate em/en dashes in
favor of standard punctuation, and adds four contextual internal links to
live WomenTech Network cybersecurity articles (breaking in, women in
cybersecurity, career paths, mentorship). External exact-match backlink
retained.

Co-Authored-By: Claude Opus 4.8 <noreply@anthropic.com>
Claude-Session: https://claude.ai/code/session_01Wt9oPLvaWEzVHPx6tC7jMm
</commit_message>
<xml_diff>
--- a/FDA-Cybersecurity-Testing-Requirements.docx
+++ b/FDA-Cybersecurity-Testing-Requirements.docx
@@ -78,10 +78,10 @@
                 <w:bCs/>
                 <w:color w:val="C00000"/>
               </w:rPr>
-              <w:t xml:space="preserve">TL;DR — </w:t>
+              <w:t xml:space="preserve">TL;DR: </w:t>
             </w:r>
             <w:r>
-              <w:t xml:space="preserve">The FDA does not hand manufacturers a fixed checklist of security tests. Under Section 524B of the FD&amp;C Act and the agency's 2023 premarket guidance, it expects companies to tie every test back to the device's own risk profile and to prove — with evidence — that security controls work and keep working.</w:t>
+              <w:t xml:space="preserve">The FDA does not hand manufacturers a fixed checklist of security tests. Under Section 524B of the FD&amp;C Act and the agency's 2023 premarket guidance, it expects companies to tie every test back to the device's own risk profile and to prove, with evidence, that security controls work and keep working.</w:t>
             </w:r>
           </w:p>
           <w:p>
@@ -102,7 +102,7 @@
         <w:spacing w:after="140" w:line="276"/>
       </w:pPr>
       <w:r>
-        <w:t xml:space="preserve">Medical devices have quietly become some of the most connected objects in a hospital. An infusion pump talks to a drug library over Wi-Fi. A pacemaker streams telemetry to a clinician's dashboard. A glucose monitor pairs with a phone app that syncs to the cloud. Each connection delivers real benefits — faster data, remote monitoring, better clinical decisions. Each also widens the attack surface of equipment that patients depend on.</w:t>
+        <w:t xml:space="preserve">Medical devices have quietly become some of the most connected objects in a hospital. An infusion pump talks to a drug library over Wi-Fi. A pacemaker streams telemetry to a clinician's dashboard. A glucose monitor pairs with a phone app that syncs to the cloud. Each connection delivers real benefits such as faster data, remote monitoring, and better clinical decisions. Each also widens the attack surface of equipment that patients depend on.</w:t>
       </w:r>
     </w:p>
     <w:p>
@@ -120,15 +120,28 @@
         <w:t xml:space="preserve">refuse to accept</w:t>
       </w:r>
       <w:r>
-        <w:t xml:space="preserve"> premarket submissions for many connected devices that lack adequate cybersecurity information. Understanding what the agency actually tests for — and what it expects manufacturers to prove — has become essential knowledge, not only for regulatory teams but for the security engineers, product leaders, and clinical-tech professionals who build and defend these systems.</w:t>
-      </w:r>
-    </w:p>
-    <w:p>
-      <w:pPr>
-        <w:spacing w:after="140" w:line="276"/>
-      </w:pPr>
-      <w:r>
-        <w:t xml:space="preserve">This is a field where demand for skilled people far outpaces supply, and it is one of the more accessible on-ramps for technologists — including the many women building careers in security and healthcare tech — who want work that is technically deep and demonstrably consequential.</w:t>
+        <w:t xml:space="preserve"> premarket submissions for many connected devices that lack adequate cybersecurity information. Understanding what the agency actually tests for, and what it expects manufacturers to prove, has become essential knowledge, not only for regulatory teams but for the security engineers, product leaders, and clinical-tech professionals who build and defend these systems.</w:t>
+      </w:r>
+    </w:p>
+    <w:p>
+      <w:pPr>
+        <w:spacing w:after="140" w:line="276"/>
+      </w:pPr>
+      <w:r>
+        <w:t xml:space="preserve">This is a field where demand for skilled people far outpaces supply, and it is one of the more accessible on-ramps for technologists, including the many </w:t>
+      </w:r>
+      <w:hyperlink w:history="1" r:id="rId9jgekmuyb-sa1xef3crod">
+        <w:r>
+          <w:rPr>
+            <w:rStyle w:val="Hyperlink"/>
+            <w:color w:val="0563C1"/>
+            <w:u w:val="single"/>
+          </w:rPr>
+          <w:t xml:space="preserve">women building careers in cybersecurity</w:t>
+        </w:r>
+      </w:hyperlink>
+      <w:r>
+        <w:t xml:space="preserve">, who want work that is technically deep and demonstrably consequential.</w:t>
       </w:r>
     </w:p>
     <w:p>
@@ -138,7 +151,7 @@
       <w:r>
         <w:t xml:space="preserve">For a comprehensive, structured reference that organizes these obligations into a usable taxonomy, this detailed guide to the </w:t>
       </w:r>
-      <w:hyperlink w:history="1" r:id="rIdmcezwiomxbrkxm6zbvhex">
+      <w:hyperlink w:history="1" r:id="rIdsmu6hju5hb4l0qul-i30c">
         <w:r>
           <w:rPr>
             <w:rStyle w:val="Hyperlink"/>
@@ -256,10 +269,10 @@
           <w:b/>
           <w:bCs/>
         </w:rPr>
-        <w:t xml:space="preserve">Make available security updates and patches</w:t>
-      </w:r>
-      <w:r>
-        <w:t xml:space="preserve"> — both on a regular cadence and out-of-cycle for critical issues.</w:t>
+        <w:t xml:space="preserve">Make available security updates and patches,</w:t>
+      </w:r>
+      <w:r>
+        <w:t xml:space="preserve"> both on a regular cadence and out-of-cycle for critical issues.</w:t>
       </w:r>
     </w:p>
     <w:p>
@@ -357,7 +370,7 @@
         <w:spacing w:after="140" w:line="276"/>
       </w:pPr>
       <w:r>
-        <w:t xml:space="preserve">The logic is straightforward: identify reasonably foreseeable threats, map how an attacker or failure could affect the device, evaluate whether the resulting risk to patient safety is adequately controlled — then </w:t>
+        <w:t xml:space="preserve">The logic is straightforward. Identify reasonably foreseeable threats, map how an attacker or failure could affect the device, and evaluate whether the resulting risk to patient safety is adequately controlled. Then </w:t>
       </w:r>
       <w:r>
         <w:rPr>
@@ -389,127 +402,127 @@
         <w:spacing w:after="140" w:line="276"/>
       </w:pPr>
       <w:r>
-        <w:t xml:space="preserve">A common misconception is that cybersecurity testing means running a scanner and fixing what it flags. Automated scanning is useful for catching known weaknesses in operating systems, libraries, and network services — but it is a starting point, not the destination. Depending on the device and its risk, a credible testing program may include:</w:t>
-      </w:r>
-    </w:p>
-    <w:p>
-      <w:pPr>
-        <w:pStyle w:val="ListParagraph"/>
-        <w:numPr>
-          <w:ilvl w:val="0"/>
-          <w:numId w:val="2"/>
-        </w:numPr>
-        <w:spacing w:after="80" w:line="276"/>
-      </w:pPr>
-      <w:r>
-        <w:rPr>
-          <w:b/>
-          <w:bCs/>
-        </w:rPr>
-        <w:t xml:space="preserve">Penetration testing</w:t>
-      </w:r>
-      <w:r>
-        <w:t xml:space="preserve"> — examining whether vulnerabilities can actually be chained and exploited to real safety or security consequences.</w:t>
-      </w:r>
-    </w:p>
-    <w:p>
-      <w:pPr>
-        <w:pStyle w:val="ListParagraph"/>
-        <w:numPr>
-          <w:ilvl w:val="0"/>
-          <w:numId w:val="2"/>
-        </w:numPr>
-        <w:spacing w:after="80" w:line="276"/>
-      </w:pPr>
-      <w:r>
-        <w:rPr>
-          <w:b/>
-          <w:bCs/>
-        </w:rPr>
-        <w:t xml:space="preserve">Fuzz testing</w:t>
-      </w:r>
-      <w:r>
-        <w:t xml:space="preserve"> — bombarding interfaces with malformed input to surface crashes and unhandled conditions.</w:t>
-      </w:r>
-    </w:p>
-    <w:p>
-      <w:pPr>
-        <w:pStyle w:val="ListParagraph"/>
-        <w:numPr>
-          <w:ilvl w:val="0"/>
-          <w:numId w:val="2"/>
-        </w:numPr>
-        <w:spacing w:after="80" w:line="276"/>
-      </w:pPr>
-      <w:r>
-        <w:rPr>
-          <w:b/>
-          <w:bCs/>
-        </w:rPr>
-        <w:t xml:space="preserve">Authentication and access-control testing</w:t>
-      </w:r>
-      <w:r>
-        <w:t xml:space="preserve"> — verifying that users, systems, and services are properly identified and limited to appropriate privileges.</w:t>
-      </w:r>
-    </w:p>
-    <w:p>
-      <w:pPr>
-        <w:pStyle w:val="ListParagraph"/>
-        <w:numPr>
-          <w:ilvl w:val="0"/>
-          <w:numId w:val="2"/>
-        </w:numPr>
-        <w:spacing w:after="80" w:line="276"/>
-      </w:pPr>
-      <w:r>
-        <w:rPr>
-          <w:b/>
-          <w:bCs/>
-        </w:rPr>
-        <w:t xml:space="preserve">Interface and attack-surface testing</w:t>
-      </w:r>
-      <w:r>
-        <w:t xml:space="preserve"> — probing debug ports, service interfaces, APIs, wireless links, and maintenance tools that rarely appear in the main UI.</w:t>
-      </w:r>
-    </w:p>
-    <w:p>
-      <w:pPr>
-        <w:pStyle w:val="ListParagraph"/>
-        <w:numPr>
-          <w:ilvl w:val="0"/>
-          <w:numId w:val="2"/>
-        </w:numPr>
-        <w:spacing w:after="80" w:line="276"/>
-      </w:pPr>
-      <w:r>
-        <w:rPr>
-          <w:b/>
-          <w:bCs/>
-        </w:rPr>
-        <w:t xml:space="preserve">Secure-communications testing</w:t>
-      </w:r>
-      <w:r>
-        <w:t xml:space="preserve"> — validating encryption, certificate handling, key management, and protocol behavior.</w:t>
-      </w:r>
-    </w:p>
-    <w:p>
-      <w:pPr>
-        <w:pStyle w:val="ListParagraph"/>
-        <w:numPr>
-          <w:ilvl w:val="0"/>
-          <w:numId w:val="2"/>
-        </w:numPr>
-        <w:spacing w:after="80" w:line="276"/>
-      </w:pPr>
-      <w:r>
-        <w:rPr>
-          <w:b/>
-          <w:bCs/>
-        </w:rPr>
-        <w:t xml:space="preserve">Software security and SBOM analysis</w:t>
-      </w:r>
-      <w:r>
-        <w:t xml:space="preserve"> — evaluating third-party and open-source components against known vulnerabilities.</w:t>
+        <w:t xml:space="preserve">A common misconception is that cybersecurity testing means running a scanner and fixing what it flags. Automated scanning is useful for catching known weaknesses in operating systems, libraries, and network services, but it is a starting point, not the destination. Depending on the device and its risk, a credible testing program may include:</w:t>
+      </w:r>
+    </w:p>
+    <w:p>
+      <w:pPr>
+        <w:pStyle w:val="ListParagraph"/>
+        <w:numPr>
+          <w:ilvl w:val="0"/>
+          <w:numId w:val="2"/>
+        </w:numPr>
+        <w:spacing w:after="80" w:line="276"/>
+      </w:pPr>
+      <w:r>
+        <w:rPr>
+          <w:b/>
+          <w:bCs/>
+        </w:rPr>
+        <w:t xml:space="preserve">Penetration testing:</w:t>
+      </w:r>
+      <w:r>
+        <w:t xml:space="preserve"> examining whether vulnerabilities can actually be chained and exploited to real safety or security consequences.</w:t>
+      </w:r>
+    </w:p>
+    <w:p>
+      <w:pPr>
+        <w:pStyle w:val="ListParagraph"/>
+        <w:numPr>
+          <w:ilvl w:val="0"/>
+          <w:numId w:val="2"/>
+        </w:numPr>
+        <w:spacing w:after="80" w:line="276"/>
+      </w:pPr>
+      <w:r>
+        <w:rPr>
+          <w:b/>
+          <w:bCs/>
+        </w:rPr>
+        <w:t xml:space="preserve">Fuzz testing:</w:t>
+      </w:r>
+      <w:r>
+        <w:t xml:space="preserve"> bombarding interfaces with malformed input to surface crashes and unhandled conditions.</w:t>
+      </w:r>
+    </w:p>
+    <w:p>
+      <w:pPr>
+        <w:pStyle w:val="ListParagraph"/>
+        <w:numPr>
+          <w:ilvl w:val="0"/>
+          <w:numId w:val="2"/>
+        </w:numPr>
+        <w:spacing w:after="80" w:line="276"/>
+      </w:pPr>
+      <w:r>
+        <w:rPr>
+          <w:b/>
+          <w:bCs/>
+        </w:rPr>
+        <w:t xml:space="preserve">Authentication and access-control testing:</w:t>
+      </w:r>
+      <w:r>
+        <w:t xml:space="preserve"> verifying that users, systems, and services are properly identified and limited to appropriate privileges.</w:t>
+      </w:r>
+    </w:p>
+    <w:p>
+      <w:pPr>
+        <w:pStyle w:val="ListParagraph"/>
+        <w:numPr>
+          <w:ilvl w:val="0"/>
+          <w:numId w:val="2"/>
+        </w:numPr>
+        <w:spacing w:after="80" w:line="276"/>
+      </w:pPr>
+      <w:r>
+        <w:rPr>
+          <w:b/>
+          <w:bCs/>
+        </w:rPr>
+        <w:t xml:space="preserve">Interface and attack-surface testing:</w:t>
+      </w:r>
+      <w:r>
+        <w:t xml:space="preserve"> probing debug ports, service interfaces, APIs, wireless links, and maintenance tools that rarely appear in the main UI.</w:t>
+      </w:r>
+    </w:p>
+    <w:p>
+      <w:pPr>
+        <w:pStyle w:val="ListParagraph"/>
+        <w:numPr>
+          <w:ilvl w:val="0"/>
+          <w:numId w:val="2"/>
+        </w:numPr>
+        <w:spacing w:after="80" w:line="276"/>
+      </w:pPr>
+      <w:r>
+        <w:rPr>
+          <w:b/>
+          <w:bCs/>
+        </w:rPr>
+        <w:t xml:space="preserve">Secure-communications testing:</w:t>
+      </w:r>
+      <w:r>
+        <w:t xml:space="preserve"> validating encryption, certificate handling, key management, and protocol behavior.</w:t>
+      </w:r>
+    </w:p>
+    <w:p>
+      <w:pPr>
+        <w:pStyle w:val="ListParagraph"/>
+        <w:numPr>
+          <w:ilvl w:val="0"/>
+          <w:numId w:val="2"/>
+        </w:numPr>
+        <w:spacing w:after="80" w:line="276"/>
+      </w:pPr>
+      <w:r>
+        <w:rPr>
+          <w:b/>
+          <w:bCs/>
+        </w:rPr>
+        <w:t xml:space="preserve">Software security and SBOM analysis:</w:t>
+      </w:r>
+      <w:r>
+        <w:t xml:space="preserve"> evaluating third-party and open-source components against known vulnerabilities.</w:t>
       </w:r>
     </w:p>
     <w:p>
@@ -527,7 +540,7 @@
         <w:t xml:space="preserve">exploitability</w:t>
       </w:r>
       <w:r>
-        <w:t xml:space="preserve">, not just the presence of a flaw. A theoretical weakness may be harmless in isolation; a chain of minor ones can hand an attacker control. Testing that follows realistic attack paths yields far more useful evidence than isolated findings viewed without context.</w:t>
+        <w:t xml:space="preserve">, not just the presence of a flaw. A theoretical weakness may be harmless in isolation, while a chain of minor ones can hand an attacker control. Testing that follows realistic attack paths yields far more useful evidence than isolated findings viewed without context.</w:t>
       </w:r>
     </w:p>
     <w:p>
@@ -549,7 +562,7 @@
         <w:spacing w:after="140" w:line="276"/>
       </w:pPr>
       <w:r>
-        <w:t xml:space="preserve">Modern devices are assembled, not written from scratch. They lean on open-source libraries, commercial middleware, and legacy operating systems built outside the manufacturer's walls. Those dependencies accelerate innovation — and quietly import vulnerabilities the manufacturer must still own.</w:t>
+        <w:t xml:space="preserve">Modern devices are assembled, not written from scratch. They lean on open-source libraries, commercial middleware, and legacy operating systems built outside the manufacturer's walls. Those dependencies accelerate innovation, and they quietly import vulnerabilities the manufacturer must still own.</w:t>
       </w:r>
     </w:p>
     <w:p>
@@ -567,7 +580,7 @@
         <w:t xml:space="preserve">SBOM</w:t>
       </w:r>
       <w:r>
-        <w:t xml:space="preserve"> gives the FDA, and the manufacturer, a reliable inventory of what software actually lives inside a device, so newly disclosed vulnerabilities can be matched against deployed components. Crucially, a vulnerability's mere presence does not condemn a device: manufacturers are expected to judge whether it is exploitable in this device's environment, what the consequences would be, and whether existing controls already reduce the risk to an acceptable level.</w:t>
+        <w:t xml:space="preserve"> gives the FDA, and the manufacturer, a reliable inventory of what software actually lives inside a device, so newly disclosed vulnerabilities can be matched against deployed components. Crucially, a vulnerability's mere presence does not condemn a device. Manufacturers are expected to judge whether it is exploitable in this device's environment, what the consequences would be, and whether existing controls already reduce the risk to an acceptable level.</w:t>
       </w:r>
     </w:p>
     <w:p>
@@ -597,7 +610,7 @@
         <w:spacing w:after="140" w:line="276"/>
       </w:pPr>
       <w:r>
-        <w:t xml:space="preserve">Authentication testing checks that identities are verified before access is granted. Access-control testing confirms that authenticated users stay inside their lane — a service technician, an administrator, a clinician, and a patient should not share the same privileges. And a thorough assessment deliberately hunts for the </w:t>
+        <w:t xml:space="preserve">Authentication testing checks that identities are verified before access is granted. Access-control testing confirms that authenticated users stay inside their lane, since a service technician, an administrator, a clinician, and a patient should not share the same privileges. And a thorough assessment deliberately hunts for the </w:t>
       </w:r>
       <w:r>
         <w:rPr>
@@ -647,7 +660,7 @@
         <w:t xml:space="preserve">altered data can be as dangerous as stolen data.</w:t>
       </w:r>
       <w:r>
-        <w:t xml:space="preserve"> A tampered measurement, a modified command, or a corrupted software package can drive an incorrect clinical decision or unsafe device behavior. Testing should therefore probe whether an attacker could modify commands, readings, configuration, or firmware in transit or at rest — because the trustworthiness of information is a safety property, not just a privacy one.</w:t>
+        <w:t xml:space="preserve"> A tampered measurement, a modified command, or a corrupted software package can drive an incorrect clinical decision or unsafe device behavior. Testing should therefore probe whether an attacker could modify commands, readings, configuration, or firmware in transit or at rest, because the trustworthiness of information is a safety property, not just a privacy one.</w:t>
       </w:r>
     </w:p>
     <w:p>
@@ -687,7 +700,7 @@
         <w:spacing w:after="140" w:line="276"/>
       </w:pPr>
       <w:r>
-        <w:t xml:space="preserve">The right response is device-specific. Sometimes continued operation is non-negotiable; sometimes failing into a documented </w:t>
+        <w:t xml:space="preserve">The right response is device-specific. Sometimes continued operation is non-negotiable, and sometimes failing into a documented </w:t>
       </w:r>
       <w:r>
         <w:rPr>
@@ -737,7 +750,7 @@
         <w:t xml:space="preserve">unresolved findings honestly.</w:t>
       </w:r>
       <w:r>
-        <w:t xml:space="preserve"> Not every issue can be eliminated before launch, and some carry little practical weight. What matters is a reasoned, consistent basis for each decision — evidence that findings were evaluated systematically rather than ignored.</w:t>
+        <w:t xml:space="preserve"> Not every issue can be eliminated before launch, and some carry little practical weight. What matters is a reasoned, consistent basis for each decision, with evidence that findings were evaluated systematically rather than ignored.</w:t>
       </w:r>
     </w:p>
     <w:p>
@@ -777,7 +790,7 @@
         <w:spacing w:after="140" w:line="276"/>
       </w:pPr>
       <w:r>
-        <w:t xml:space="preserve">Manufacturers need live processes to monitor vulnerabilities, assess their relevance to fielded products, and act when correction is warranted — and to communicate clearly with the healthcare organizations running the devices.</w:t>
+        <w:t xml:space="preserve">Manufacturers need live processes to monitor vulnerabilities, assess their relevance to fielded products, and act when correction is warranted, and to communicate clearly with the healthcare organizations running the devices.</w:t>
       </w:r>
     </w:p>
     <w:p>
@@ -807,7 +820,54 @@
         <w:spacing w:after="140" w:line="276"/>
       </w:pPr>
       <w:r>
-        <w:t xml:space="preserve">For technologists weighing where to specialize — including the growing community of women in cybersecurity and health tech — medical device security offers an unusually clear value proposition: the work is technically rigorous, the regulatory framework gives it durability, and the outcome is measured in patient safety rather than abstract compliance. It is a field where getting the testing right genuinely matters.</w:t>
+        <w:t xml:space="preserve">For technologists weighing where to specialize, including the growing community of </w:t>
+      </w:r>
+      <w:hyperlink w:history="1" r:id="rIdl3cklfbo0pvyxd4matfnm">
+        <w:r>
+          <w:rPr>
+            <w:rStyle w:val="Hyperlink"/>
+            <w:color w:val="0563C1"/>
+            <w:u w:val="single"/>
+          </w:rPr>
+          <w:t xml:space="preserve">women in cybersecurity</w:t>
+        </w:r>
+      </w:hyperlink>
+      <w:r>
+        <w:t xml:space="preserve"> and health tech, medical device security offers an unusually clear value proposition. The work is technically rigorous, the regulatory framework gives it durability, and the outcome is measured in patient safety rather than abstract compliance. It is a field where getting the testing right genuinely matters.</w:t>
+      </w:r>
+    </w:p>
+    <w:p>
+      <w:pPr>
+        <w:spacing w:after="140" w:line="276"/>
+      </w:pPr>
+      <w:r>
+        <w:t xml:space="preserve">If you are mapping your next move, it helps to study the </w:t>
+      </w:r>
+      <w:hyperlink w:history="1" r:id="rIdvkkhab6rj-hbe38nnnjte">
+        <w:r>
+          <w:rPr>
+            <w:rStyle w:val="Hyperlink"/>
+            <w:color w:val="0563C1"/>
+            <w:u w:val="single"/>
+          </w:rPr>
+          <w:t xml:space="preserve">cybersecurity career paths</w:t>
+        </w:r>
+      </w:hyperlink>
+      <w:r>
+        <w:t xml:space="preserve"> available in the sector and to lean on </w:t>
+      </w:r>
+      <w:hyperlink w:history="1" r:id="rId9j3nd-t3yvhvhdpilqaxg">
+        <w:r>
+          <w:rPr>
+            <w:rStyle w:val="Hyperlink"/>
+            <w:color w:val="0563C1"/>
+            <w:u w:val="single"/>
+          </w:rPr>
+          <w:t xml:space="preserve">cybersecurity mentorship</w:t>
+        </w:r>
+      </w:hyperlink>
+      <w:r>
+        <w:t xml:space="preserve">, which remains one of the fastest ways to translate technical curiosity into a durable role.</w:t>
       </w:r>
     </w:p>
     <w:p>
@@ -984,7 +1044,7 @@
         <w:spacing w:after="140" w:line="276"/>
       </w:pPr>
       <w:r>
-        <w:t xml:space="preserve">Section 524B, added by the Consolidated Appropriations Act of 2023, requires manufacturers of “cyber devices” to include cybersecurity information in premarket submissions — including a vulnerability-management plan, assurance of secure design, a patch and update process, and a software bill of materials. The FDA can refuse to accept submissions that don't meet it.</w:t>
+        <w:t xml:space="preserve">Section 524B, added by the Consolidated Appropriations Act of 2023, requires manufacturers of “cyber devices” to include cybersecurity information in premarket submissions, including a vulnerability-management plan, assurance of secure design, a patch and update process, and a software bill of materials. The FDA can refuse to accept submissions that do not meet it.</w:t>
       </w:r>
     </w:p>
     <w:p>
@@ -1047,7 +1107,7 @@
         <w:spacing w:after="140" w:line="276"/>
       </w:pPr>
       <w:r>
-        <w:t xml:space="preserve">No. It is a lifecycle responsibility. Manufacturers must monitor for new vulnerabilities, assess their relevance to fielded devices, and provide security updates and patches — on a regular schedule and out-of-cycle for critical issues.</w:t>
+        <w:t xml:space="preserve">No. It is a lifecycle responsibility. Manufacturers must monitor for new vulnerabilities, assess their relevance to fielded devices, and provide security updates and patches, on a regular schedule and out-of-cycle for critical issues.</w:t>
       </w:r>
     </w:p>
     <w:p>
@@ -1068,7 +1128,7 @@
         <w:spacing w:after="140" w:line="276"/>
       </w:pPr>
       <w:r>
-        <w:t xml:space="preserve">A mix of in-house product security teams and independent specialists. Common roles include product security engineers, penetration testers, vulnerability and SBOM analysts, and regulatory-affairs professionals — a fast-growing set of career paths in healthcare cybersecurity.</w:t>
+        <w:t xml:space="preserve">A mix of in-house product security teams and independent specialists. Common roles include product security engineers, penetration testers, vulnerability and SBOM analysts, and regulatory-affairs professionals, a fast-growing set of career paths in healthcare cybersecurity.</w:t>
       </w:r>
     </w:p>
     <w:p>
@@ -1141,7 +1201,7 @@
       <w:r>
         <w:t xml:space="preserve">Blue Goat Cyber, a detailed breakdown of the </w:t>
       </w:r>
-      <w:hyperlink w:history="1" r:id="rIdrfmk3hycea2pty-c8ierw">
+      <w:hyperlink w:history="1" r:id="rIdncpovx8akxxtwwbcocl23">
         <w:r>
           <w:rPr>
             <w:rStyle w:val="Hyperlink"/>
@@ -1157,6 +1217,67 @@
     </w:p>
     <w:p>
       <w:pPr>
+        <w:spacing w:after="140" w:line="276"/>
+      </w:pPr>
+      <w:r>
+        <w:rPr>
+          <w:b/>
+          <w:bCs/>
+        </w:rPr>
+        <w:t xml:space="preserve">Related on WomenTech Network: </w:t>
+      </w:r>
+      <w:hyperlink w:history="1" r:id="rIdbamffr2h4qcjewuo5wtxe">
+        <w:r>
+          <w:rPr>
+            <w:rStyle w:val="Hyperlink"/>
+            <w:color w:val="0563C1"/>
+            <w:u w:val="single"/>
+          </w:rPr>
+          <w:t xml:space="preserve">Breaking into cybersecurity</w:t>
+        </w:r>
+      </w:hyperlink>
+      <w:r>
+        <w:t xml:space="preserve">  ·  </w:t>
+      </w:r>
+      <w:hyperlink w:history="1" r:id="rId8uux14ebu4f8933mngngc">
+        <w:r>
+          <w:rPr>
+            <w:rStyle w:val="Hyperlink"/>
+            <w:color w:val="0563C1"/>
+            <w:u w:val="single"/>
+          </w:rPr>
+          <w:t xml:space="preserve">Women in cybersecurity</w:t>
+        </w:r>
+      </w:hyperlink>
+      <w:r>
+        <w:t xml:space="preserve">  ·  </w:t>
+      </w:r>
+      <w:hyperlink w:history="1" r:id="rIdz4y_ud0wlckbfmihrmlal">
+        <w:r>
+          <w:rPr>
+            <w:rStyle w:val="Hyperlink"/>
+            <w:color w:val="0563C1"/>
+            <w:u w:val="single"/>
+          </w:rPr>
+          <w:t xml:space="preserve">Cybersecurity career paths</w:t>
+        </w:r>
+      </w:hyperlink>
+      <w:r>
+        <w:t xml:space="preserve">  ·  </w:t>
+      </w:r>
+      <w:hyperlink w:history="1" r:id="rIdmku2gp3l0cet-qjndab5h">
+        <w:r>
+          <w:rPr>
+            <w:rStyle w:val="Hyperlink"/>
+            <w:color w:val="0563C1"/>
+            <w:u w:val="single"/>
+          </w:rPr>
+          <w:t xml:space="preserve">Cybersecurity mentorship</w:t>
+        </w:r>
+      </w:hyperlink>
+    </w:p>
+    <w:p>
+      <w:pPr>
         <w:pBdr>
           <w:bottom w:val="single" w:color="BFBFBF" w:sz="6" w:space="1"/>
         </w:pBdr>
@@ -1204,7 +1325,7 @@
         <w:t xml:space="preserve">Meta description: </w:t>
       </w:r>
       <w:r>
-        <w:t xml:space="preserve">A clear, journalistic breakdown of FDA cybersecurity testing requirements for medical devices — from risk-based scope and SBOMs to penetration testing, documentation, and lifecycle duties under Section 524B.</w:t>
+        <w:t xml:space="preserve">A clear, journalistic breakdown of FDA cybersecurity testing requirements for medical devices, from risk-based scope and SBOMs to penetration testing, documentation, and lifecycle duties under Section 524B.</w:t>
       </w:r>
     </w:p>
     <w:p>
@@ -1261,10 +1382,25 @@
           <w:b/>
           <w:bCs/>
         </w:rPr>
-        <w:t xml:space="preserve">Backlink: </w:t>
-      </w:r>
-      <w:r>
-        <w:t xml:space="preserve">Exact-match anchor “FDA cybersecurity testing requirements” → bluegoatcyber.com guide (single do-follow)</w:t>
+        <w:t xml:space="preserve">External backlink: </w:t>
+      </w:r>
+      <w:r>
+        <w:t xml:space="preserve">Exact-match anchor “FDA cybersecurity testing requirements” to the Blue Goat Cyber guide (single do-follow)</w:t>
+      </w:r>
+    </w:p>
+    <w:p>
+      <w:pPr>
+        <w:spacing w:after="60"/>
+      </w:pPr>
+      <w:r>
+        <w:rPr>
+          <w:b/>
+          <w:bCs/>
+        </w:rPr>
+        <w:t xml:space="preserve">Internal links: </w:t>
+      </w:r>
+      <w:r>
+        <w:t xml:space="preserve">Four live WomenTech Network articles: breaking into cybersecurity, women in cybersecurity, career paths, cybersecurity mentorship</w:t>
       </w:r>
     </w:p>
     <w:p>

</xml_diff>